<commit_message>
Add yamach stock figure and update helmet balance totals
Co-Authored-By: Claude Fable 5 <noreply@anthropic.com>
Claude-Session: https://claude.ai/code/session_01GURPYRA9RhKriezzsz79s1
</commit_message>
<xml_diff>
--- a/helmet_tracking.docx
+++ b/helmet_tracking.docx
@@ -928,7 +928,7 @@
           <w:bCs w:val="false"/>
           <w:rtl/>
         </w:rPr>
-        <w:t xml:space="preserve">בתאריך 6.1.2026 בוצעה ספירת תיקים בימ"ח. במסגרת הספירה נספרו 291 קסדות בימ"ח, ובנוסף ביצע הגדוד וידוא לקסדות הנמצאות מחוץ לימ"ח, בפילוח הבא:</w:t>
+        <w:t xml:space="preserve">בתאריך 6.1.2026 בוצעה ספירת תיקים בימ"ח. במסגרת הספירה נספרו 291 קסדות בתיקים, ובנוסף קיימות 15 יח' במלאי הימ"ח. כמו כן ביצע הגדוד וידוא לקסדות הנמצאות מחוץ לימ"ח, בפילוח הבא:</w:t>
       </w:r>
     </w:p>
     <w:tbl>
@@ -1666,7 +1666,7 @@
                 <w:szCs w:val="22"/>
                 <w:rtl/>
               </w:rPr>
-              <w:t xml:space="preserve">נספרו בימ"ח (6.1.2026)</w:t>
+              <w:t xml:space="preserve">נספרו בספירת תיקים בימ"ח (6.1.2026)</w:t>
             </w:r>
           </w:p>
         </w:tc>
@@ -1729,7 +1729,7 @@
                 <w:szCs w:val="22"/>
                 <w:rtl/>
               </w:rPr>
-              <w:t xml:space="preserve">מאומתות מחוץ לימ"ח (פלוגות)</w:t>
+              <w:t xml:space="preserve">מלאי ימ"ח</w:t>
             </w:r>
           </w:p>
         </w:tc>
@@ -1759,7 +1759,7 @@
                 <w:szCs w:val="22"/>
                 <w:rtl/>
               </w:rPr>
-              <w:t xml:space="preserve">59</w:t>
+              <w:t xml:space="preserve">15</w:t>
             </w:r>
           </w:p>
         </w:tc>
@@ -1786,6 +1786,69 @@
             <w:r>
               <w:rPr>
                 <w:rFonts w:ascii="Arial" w:cs="Arial" w:eastAsia="Arial" w:hAnsi="Arial"/>
+                <w:b w:val="function bold() { [native code] }"/>
+                <w:bCs w:val="function bold() { [native code] }"/>
+                <w:sz w:val="22"/>
+                <w:szCs w:val="22"/>
+                <w:rtl/>
+              </w:rPr>
+              <w:t xml:space="preserve">מאומתות מחוץ לימ"ח (פלוגות)</w:t>
+            </w:r>
+          </w:p>
+        </w:tc>
+        <w:tc>
+          <w:tcPr>
+            <w:tcW w:type="dxa" w:w="2500"/>
+            <w:shd w:fill="F2F2F2" w:val="clear"/>
+            <w:tcMar>
+              <w:top w:type="dxa" w:w="60"/>
+              <w:left w:type="dxa" w:w="100"/>
+              <w:bottom w:type="dxa" w:w="60"/>
+              <w:right w:type="dxa" w:w="100"/>
+            </w:tcMar>
+            <w:vAlign w:val="center"/>
+          </w:tcPr>
+          <w:p>
+            <w:pPr>
+              <w:bidi/>
+              <w:spacing w:after="0"/>
+              <w:jc w:val="center"/>
+            </w:pPr>
+            <w:r>
+              <w:rPr>
+                <w:rFonts w:ascii="Arial" w:cs="Arial" w:eastAsia="Arial" w:hAnsi="Arial"/>
+                <w:b w:val="function bold() { [native code] }"/>
+                <w:bCs w:val="function bold() { [native code] }"/>
+                <w:sz w:val="22"/>
+                <w:szCs w:val="22"/>
+                <w:rtl/>
+              </w:rPr>
+              <w:t xml:space="preserve">59</w:t>
+            </w:r>
+          </w:p>
+        </w:tc>
+      </w:tr>
+      <w:tr>
+        <w:tc>
+          <w:tcPr>
+            <w:tcW w:type="dxa" w:w="5500"/>
+            <w:tcMar>
+              <w:top w:type="dxa" w:w="60"/>
+              <w:left w:type="dxa" w:w="100"/>
+              <w:bottom w:type="dxa" w:w="60"/>
+              <w:right w:type="dxa" w:w="100"/>
+            </w:tcMar>
+            <w:vAlign w:val="center"/>
+          </w:tcPr>
+          <w:p>
+            <w:pPr>
+              <w:bidi/>
+              <w:spacing w:after="0"/>
+              <w:jc w:val="center"/>
+            </w:pPr>
+            <w:r>
+              <w:rPr>
+                <w:rFonts w:ascii="Arial" w:cs="Arial" w:eastAsia="Arial" w:hAnsi="Arial"/>
                 <w:b/>
                 <w:bCs/>
                 <w:sz w:val="22"/>
@@ -1799,7 +1862,6 @@
         <w:tc>
           <w:tcPr>
             <w:tcW w:type="dxa" w:w="2500"/>
-            <w:shd w:fill="F2F2F2" w:val="clear"/>
             <w:tcMar>
               <w:top w:type="dxa" w:w="60"/>
               <w:left w:type="dxa" w:w="100"/>
@@ -1823,7 +1885,7 @@
                 <w:szCs w:val="22"/>
                 <w:rtl/>
               </w:rPr>
-              <w:t xml:space="preserve">361</w:t>
+              <w:t xml:space="preserve">365</w:t>
             </w:r>
           </w:p>
         </w:tc>
@@ -1832,6 +1894,7 @@
         <w:tc>
           <w:tcPr>
             <w:tcW w:type="dxa" w:w="5500"/>
+            <w:shd w:fill="F2F2F2" w:val="clear"/>
             <w:tcMar>
               <w:top w:type="dxa" w:w="60"/>
               <w:left w:type="dxa" w:w="100"/>
@@ -1862,6 +1925,7 @@
         <w:tc>
           <w:tcPr>
             <w:tcW w:type="dxa" w:w="2500"/>
+            <w:shd w:fill="F2F2F2" w:val="clear"/>
             <w:tcMar>
               <w:top w:type="dxa" w:w="60"/>
               <w:left w:type="dxa" w:w="100"/>
@@ -1886,7 +1950,7 @@
                 <w:szCs w:val="22"/>
                 <w:rtl/>
               </w:rPr>
-              <w:t xml:space="preserve">37</w:t>
+              <w:t xml:space="preserve">33</w:t>
             </w:r>
           </w:p>
         </w:tc>
@@ -1964,7 +2028,7 @@
           <w:bCs w:val="false"/>
           <w:rtl/>
         </w:rPr>
-        <w:t xml:space="preserve">סכימת הספירה (291 בימ"ח + 59 מחוץ לימ"ח) מסתכמת ב-350 יח', בעוד שסך הקסדות הידועות דווח כ-361 יח'. נדרש וידוא של 11 היח' המהוות את ההפרש.</w:t>
+        <w:t xml:space="preserve">סכימת הספירה: 291 בתיקים + 15 מלאי ימ"ח + 59 מחוץ לימ"ח = 365 יח'. יצוין כי בדיווח קודם צוין סך של 361 יח' — הפרש של 4 יח' לווידוא.</w:t>
       </w:r>
     </w:p>
     <w:p>
@@ -1985,7 +2049,7 @@
           <w:bCs w:val="false"/>
           <w:rtl/>
         </w:rPr>
-        <w:t xml:space="preserve">נדרש להמשיך באיתור 37 היח' שמיקומן טרם אומת (398 שהתקבלו מול 361 ידועות).</w:t>
+        <w:t xml:space="preserve">נדרש להמשיך באיתור 33 היח' שמיקומן טרם אומת (398 שהתקבלו מול 365 ידועות).</w:t>
       </w:r>
     </w:p>
     <w:sectPr>

</xml_diff>

<commit_message>
Use verified count of 365 and add order-transcription appendices
Co-Authored-By: Claude Fable 5 <noreply@anthropic.com>
Claude-Session: https://claude.ai/code/session_01GURPYRA9RhKriezzsz79s1
</commit_message>
<xml_diff>
--- a/helmet_tracking.docx
+++ b/helmet_tracking.docx
@@ -2028,7 +2028,7 @@
           <w:bCs w:val="false"/>
           <w:rtl/>
         </w:rPr>
-        <w:t xml:space="preserve">סכימת הספירה: 291 בתיקים + 15 מלאי ימ"ח + 59 מחוץ לימ"ח = 365 יח'. יצוין כי בדיווח קודם צוין סך של 361 יח' — הפרש של 4 יח' לווידוא.</w:t>
+        <w:t xml:space="preserve">סכימת הספירה: 291 בתיקים + 15 מלאי ימ"ח + 59 מחוץ לימ"ח = 365 יח' שמיקומן ידוע.</w:t>
       </w:r>
     </w:p>
     <w:p>
@@ -2052,6 +2052,1600 @@
         <w:t xml:space="preserve">נדרש להמשיך באיתור 33 היח' שמיקומן טרם אומת (398 שהתקבלו מול 365 ידועות).</w:t>
       </w:r>
     </w:p>
+    <w:p>
+      <w:r>
+        <w:br w:type="page"/>
+      </w:r>
+    </w:p>
+    <w:p>
+      <w:pPr>
+        <w:pStyle w:val="Heading1"/>
+        <w:bidi/>
+        <w:spacing w:after="120" w:before="240"/>
+        <w:jc w:val="right"/>
+      </w:pPr>
+      <w:r>
+        <w:rPr>
+          <w:rFonts w:ascii="Arial" w:cs="Arial" w:eastAsia="Arial" w:hAnsi="Arial"/>
+          <w:b/>
+          <w:bCs/>
+          <w:rtl/>
+        </w:rPr>
+        <w:t xml:space="preserve">6. נספחים — אסמכתאות</w:t>
+      </w:r>
+    </w:p>
+    <w:p>
+      <w:pPr>
+        <w:bidi/>
+        <w:spacing w:after="100" w:before="120"/>
+        <w:jc w:val="right"/>
+      </w:pPr>
+      <w:r>
+        <w:rPr>
+          <w:rFonts w:ascii="Arial" w:cs="Arial" w:eastAsia="Arial" w:hAnsi="Arial"/>
+          <w:b/>
+          <w:bCs/>
+          <w:rtl/>
+        </w:rPr>
+        <w:t xml:space="preserve">נספח א' — פקודת חלוקת ציוד לחימה וקסדות שחר, 25.9.2025 (הופצה 18.9.2025)</w:t>
+      </w:r>
+    </w:p>
+    <w:p>
+      <w:pPr>
+        <w:bidi/>
+        <w:spacing w:after="120"/>
+        <w:jc w:val="right"/>
+      </w:pPr>
+      <w:r>
+        <w:rPr>
+          <w:rFonts w:ascii="Arial" w:cs="Arial" w:eastAsia="Arial" w:hAnsi="Arial"/>
+          <w:b w:val="false"/>
+          <w:bCs w:val="false"/>
+          <w:sz w:val="20"/>
+          <w:szCs w:val="20"/>
+          <w:rtl/>
+        </w:rPr>
+        <w:t xml:space="preserve">שורת הקסדות הטקטיות מתוך טבלת החלוקה החטיבתית (שוחזר מצילום הפקודה):</w:t>
+      </w:r>
+    </w:p>
+    <w:tbl>
+      <w:tblPr>
+        <w:bidiVisual/>
+        <w:tblW w:type="dxa" w:w="9400"/>
+        <w:tblBorders>
+          <w:top w:val="single" w:color="auto" w:sz="4"/>
+          <w:left w:val="single" w:color="auto" w:sz="4"/>
+          <w:bottom w:val="single" w:color="auto" w:sz="4"/>
+          <w:right w:val="single" w:color="auto" w:sz="4"/>
+          <w:insideH w:val="single" w:color="auto" w:sz="4"/>
+          <w:insideV w:val="single" w:color="auto" w:sz="4"/>
+        </w:tblBorders>
+      </w:tblPr>
+      <w:tblGrid>
+        <w:gridCol w:w="2000"/>
+        <w:gridCol w:w="1100"/>
+        <w:gridCol w:w="1050"/>
+        <w:gridCol w:w="1050"/>
+        <w:gridCol w:w="1050"/>
+        <w:gridCol w:w="1000"/>
+        <w:gridCol w:w="1000"/>
+        <w:gridCol w:w="1150"/>
+      </w:tblGrid>
+      <w:tr>
+        <w:tc>
+          <w:tcPr>
+            <w:tcW w:type="dxa" w:w="2000"/>
+            <w:shd w:fill="9E1B1B" w:val="clear"/>
+            <w:tcMar>
+              <w:top w:type="dxa" w:w="60"/>
+              <w:left w:type="dxa" w:w="100"/>
+              <w:bottom w:type="dxa" w:w="60"/>
+              <w:right w:type="dxa" w:w="100"/>
+            </w:tcMar>
+            <w:vAlign w:val="center"/>
+          </w:tcPr>
+          <w:p>
+            <w:pPr>
+              <w:bidi/>
+              <w:spacing w:after="0"/>
+              <w:jc w:val="center"/>
+            </w:pPr>
+            <w:r>
+              <w:rPr>
+                <w:rFonts w:ascii="Arial" w:cs="Arial" w:eastAsia="Arial" w:hAnsi="Arial"/>
+                <w:b/>
+                <w:bCs/>
+                <w:color w:val="FFFFFF"/>
+                <w:sz w:val="22"/>
+                <w:szCs w:val="22"/>
+                <w:rtl/>
+              </w:rPr>
+              <w:t xml:space="preserve">פריט</w:t>
+            </w:r>
+          </w:p>
+        </w:tc>
+        <w:tc>
+          <w:tcPr>
+            <w:tcW w:type="dxa" w:w="1100"/>
+            <w:shd w:fill="9E1B1B" w:val="clear"/>
+            <w:tcMar>
+              <w:top w:type="dxa" w:w="60"/>
+              <w:left w:type="dxa" w:w="100"/>
+              <w:bottom w:type="dxa" w:w="60"/>
+              <w:right w:type="dxa" w:w="100"/>
+            </w:tcMar>
+            <w:vAlign w:val="center"/>
+          </w:tcPr>
+          <w:p>
+            <w:pPr>
+              <w:bidi/>
+              <w:spacing w:after="0"/>
+              <w:jc w:val="center"/>
+            </w:pPr>
+            <w:r>
+              <w:rPr>
+                <w:rFonts w:ascii="Arial" w:cs="Arial" w:eastAsia="Arial" w:hAnsi="Arial"/>
+                <w:b/>
+                <w:bCs/>
+                <w:color w:val="FFFFFF"/>
+                <w:sz w:val="22"/>
+                <w:szCs w:val="22"/>
+                <w:rtl/>
+              </w:rPr>
+              <w:t xml:space="preserve">גדס"ר 6623</w:t>
+            </w:r>
+          </w:p>
+        </w:tc>
+        <w:tc>
+          <w:tcPr>
+            <w:tcW w:type="dxa" w:w="1050"/>
+            <w:shd w:fill="9E1B1B" w:val="clear"/>
+            <w:tcMar>
+              <w:top w:type="dxa" w:w="60"/>
+              <w:left w:type="dxa" w:w="100"/>
+              <w:bottom w:type="dxa" w:w="60"/>
+              <w:right w:type="dxa" w:w="100"/>
+            </w:tcMar>
+            <w:vAlign w:val="center"/>
+          </w:tcPr>
+          <w:p>
+            <w:pPr>
+              <w:bidi/>
+              <w:spacing w:after="0"/>
+              <w:jc w:val="center"/>
+            </w:pPr>
+            <w:r>
+              <w:rPr>
+                <w:rFonts w:ascii="Arial" w:cs="Arial" w:eastAsia="Arial" w:hAnsi="Arial"/>
+                <w:b/>
+                <w:bCs/>
+                <w:color w:val="FFFFFF"/>
+                <w:sz w:val="22"/>
+                <w:szCs w:val="22"/>
+                <w:rtl/>
+              </w:rPr>
+              <w:t xml:space="preserve">גדוד 71</w:t>
+            </w:r>
+          </w:p>
+        </w:tc>
+        <w:tc>
+          <w:tcPr>
+            <w:tcW w:type="dxa" w:w="1050"/>
+            <w:shd w:fill="9E1B1B" w:val="clear"/>
+            <w:tcMar>
+              <w:top w:type="dxa" w:w="60"/>
+              <w:left w:type="dxa" w:w="100"/>
+              <w:bottom w:type="dxa" w:w="60"/>
+              <w:right w:type="dxa" w:w="100"/>
+            </w:tcMar>
+            <w:vAlign w:val="center"/>
+          </w:tcPr>
+          <w:p>
+            <w:pPr>
+              <w:bidi/>
+              <w:spacing w:after="0"/>
+              <w:jc w:val="center"/>
+            </w:pPr>
+            <w:r>
+              <w:rPr>
+                <w:rFonts w:ascii="Arial" w:cs="Arial" w:eastAsia="Arial" w:hAnsi="Arial"/>
+                <w:b/>
+                <w:bCs/>
+                <w:color w:val="FFFFFF"/>
+                <w:sz w:val="22"/>
+                <w:szCs w:val="22"/>
+                <w:rtl/>
+              </w:rPr>
+              <w:t xml:space="preserve">גדוד 66</w:t>
+            </w:r>
+          </w:p>
+        </w:tc>
+        <w:tc>
+          <w:tcPr>
+            <w:tcW w:type="dxa" w:w="1050"/>
+            <w:shd w:fill="9E1B1B" w:val="clear"/>
+            <w:tcMar>
+              <w:top w:type="dxa" w:w="60"/>
+              <w:left w:type="dxa" w:w="100"/>
+              <w:bottom w:type="dxa" w:w="60"/>
+              <w:right w:type="dxa" w:w="100"/>
+            </w:tcMar>
+            <w:vAlign w:val="center"/>
+          </w:tcPr>
+          <w:p>
+            <w:pPr>
+              <w:bidi/>
+              <w:spacing w:after="0"/>
+              <w:jc w:val="center"/>
+            </w:pPr>
+            <w:r>
+              <w:rPr>
+                <w:rFonts w:ascii="Arial" w:cs="Arial" w:eastAsia="Arial" w:hAnsi="Arial"/>
+                <w:b/>
+                <w:bCs/>
+                <w:color w:val="FFFFFF"/>
+                <w:sz w:val="22"/>
+                <w:szCs w:val="22"/>
+                <w:rtl/>
+              </w:rPr>
+              <w:t xml:space="preserve">גדוד 28</w:t>
+            </w:r>
+          </w:p>
+        </w:tc>
+        <w:tc>
+          <w:tcPr>
+            <w:tcW w:type="dxa" w:w="1000"/>
+            <w:shd w:fill="9E1B1B" w:val="clear"/>
+            <w:tcMar>
+              <w:top w:type="dxa" w:w="60"/>
+              <w:left w:type="dxa" w:w="100"/>
+              <w:bottom w:type="dxa" w:w="60"/>
+              <w:right w:type="dxa" w:w="100"/>
+            </w:tcMar>
+            <w:vAlign w:val="center"/>
+          </w:tcPr>
+          <w:p>
+            <w:pPr>
+              <w:bidi/>
+              <w:spacing w:after="0"/>
+              <w:jc w:val="center"/>
+            </w:pPr>
+            <w:r>
+              <w:rPr>
+                <w:rFonts w:ascii="Arial" w:cs="Arial" w:eastAsia="Arial" w:hAnsi="Arial"/>
+                <w:b/>
+                <w:bCs/>
+                <w:color w:val="FFFFFF"/>
+                <w:sz w:val="22"/>
+                <w:szCs w:val="22"/>
+                <w:rtl/>
+              </w:rPr>
+              <w:t xml:space="preserve">גדס"ם</w:t>
+            </w:r>
+          </w:p>
+        </w:tc>
+        <w:tc>
+          <w:tcPr>
+            <w:tcW w:type="dxa" w:w="1000"/>
+            <w:shd w:fill="9E1B1B" w:val="clear"/>
+            <w:tcMar>
+              <w:top w:type="dxa" w:w="60"/>
+              <w:left w:type="dxa" w:w="100"/>
+              <w:bottom w:type="dxa" w:w="60"/>
+              <w:right w:type="dxa" w:w="100"/>
+            </w:tcMar>
+            <w:vAlign w:val="center"/>
+          </w:tcPr>
+          <w:p>
+            <w:pPr>
+              <w:bidi/>
+              <w:spacing w:after="0"/>
+              <w:jc w:val="center"/>
+            </w:pPr>
+            <w:r>
+              <w:rPr>
+                <w:rFonts w:ascii="Arial" w:cs="Arial" w:eastAsia="Arial" w:hAnsi="Arial"/>
+                <w:b/>
+                <w:bCs/>
+                <w:color w:val="FFFFFF"/>
+                <w:sz w:val="22"/>
+                <w:szCs w:val="22"/>
+                <w:rtl/>
+              </w:rPr>
+              <w:t xml:space="preserve">פלת"צ</w:t>
+            </w:r>
+          </w:p>
+        </w:tc>
+        <w:tc>
+          <w:tcPr>
+            <w:tcW w:type="dxa" w:w="1150"/>
+            <w:shd w:fill="9E1B1B" w:val="clear"/>
+            <w:tcMar>
+              <w:top w:type="dxa" w:w="60"/>
+              <w:left w:type="dxa" w:w="100"/>
+              <w:bottom w:type="dxa" w:w="60"/>
+              <w:right w:type="dxa" w:w="100"/>
+            </w:tcMar>
+            <w:vAlign w:val="center"/>
+          </w:tcPr>
+          <w:p>
+            <w:pPr>
+              <w:bidi/>
+              <w:spacing w:after="0"/>
+              <w:jc w:val="center"/>
+            </w:pPr>
+            <w:r>
+              <w:rPr>
+                <w:rFonts w:ascii="Arial" w:cs="Arial" w:eastAsia="Arial" w:hAnsi="Arial"/>
+                <w:b/>
+                <w:bCs/>
+                <w:color w:val="FFFFFF"/>
+                <w:sz w:val="22"/>
+                <w:szCs w:val="22"/>
+                <w:rtl/>
+              </w:rPr>
+              <w:t xml:space="preserve">סה"כ</w:t>
+            </w:r>
+          </w:p>
+        </w:tc>
+      </w:tr>
+      <w:tr>
+        <w:tc>
+          <w:tcPr>
+            <w:tcW w:type="dxa" w:w="2000"/>
+            <w:tcMar>
+              <w:top w:type="dxa" w:w="60"/>
+              <w:left w:type="dxa" w:w="100"/>
+              <w:bottom w:type="dxa" w:w="60"/>
+              <w:right w:type="dxa" w:w="100"/>
+            </w:tcMar>
+            <w:vAlign w:val="center"/>
+          </w:tcPr>
+          <w:p>
+            <w:pPr>
+              <w:bidi/>
+              <w:spacing w:after="0"/>
+              <w:jc w:val="center"/>
+            </w:pPr>
+            <w:r>
+              <w:rPr>
+                <w:rFonts w:ascii="Arial" w:cs="Arial" w:eastAsia="Arial" w:hAnsi="Arial"/>
+                <w:b w:val="function bold() { [native code] }"/>
+                <w:bCs w:val="function bold() { [native code] }"/>
+                <w:sz w:val="22"/>
+                <w:szCs w:val="22"/>
+                <w:rtl/>
+              </w:rPr>
+              <w:t xml:space="preserve">קסדה טקטית — פעימה א'</w:t>
+            </w:r>
+          </w:p>
+        </w:tc>
+        <w:tc>
+          <w:tcPr>
+            <w:tcW w:type="dxa" w:w="1100"/>
+            <w:tcMar>
+              <w:top w:type="dxa" w:w="60"/>
+              <w:left w:type="dxa" w:w="100"/>
+              <w:bottom w:type="dxa" w:w="60"/>
+              <w:right w:type="dxa" w:w="100"/>
+            </w:tcMar>
+            <w:vAlign w:val="center"/>
+          </w:tcPr>
+          <w:p>
+            <w:pPr>
+              <w:bidi/>
+              <w:spacing w:after="0"/>
+              <w:jc w:val="center"/>
+            </w:pPr>
+            <w:r>
+              <w:rPr>
+                <w:rFonts w:ascii="Arial" w:cs="Arial" w:eastAsia="Arial" w:hAnsi="Arial"/>
+                <w:b w:val="function bold() { [native code] }"/>
+                <w:bCs w:val="function bold() { [native code] }"/>
+                <w:sz w:val="22"/>
+                <w:szCs w:val="22"/>
+                <w:rtl/>
+              </w:rPr>
+              <w:t xml:space="preserve">387</w:t>
+            </w:r>
+          </w:p>
+        </w:tc>
+        <w:tc>
+          <w:tcPr>
+            <w:tcW w:type="dxa" w:w="1050"/>
+            <w:tcMar>
+              <w:top w:type="dxa" w:w="60"/>
+              <w:left w:type="dxa" w:w="100"/>
+              <w:bottom w:type="dxa" w:w="60"/>
+              <w:right w:type="dxa" w:w="100"/>
+            </w:tcMar>
+            <w:vAlign w:val="center"/>
+          </w:tcPr>
+          <w:p>
+            <w:pPr>
+              <w:bidi/>
+              <w:spacing w:after="0"/>
+              <w:jc w:val="center"/>
+            </w:pPr>
+            <w:r>
+              <w:rPr>
+                <w:rFonts w:ascii="Arial" w:cs="Arial" w:eastAsia="Arial" w:hAnsi="Arial"/>
+                <w:b w:val="function bold() { [native code] }"/>
+                <w:bCs w:val="function bold() { [native code] }"/>
+                <w:sz w:val="22"/>
+                <w:szCs w:val="22"/>
+                <w:rtl/>
+              </w:rPr>
+              <w:t xml:space="preserve">327</w:t>
+            </w:r>
+          </w:p>
+        </w:tc>
+        <w:tc>
+          <w:tcPr>
+            <w:tcW w:type="dxa" w:w="1050"/>
+            <w:tcMar>
+              <w:top w:type="dxa" w:w="60"/>
+              <w:left w:type="dxa" w:w="100"/>
+              <w:bottom w:type="dxa" w:w="60"/>
+              <w:right w:type="dxa" w:w="100"/>
+            </w:tcMar>
+            <w:vAlign w:val="center"/>
+          </w:tcPr>
+          <w:p>
+            <w:pPr>
+              <w:bidi/>
+              <w:spacing w:after="0"/>
+              <w:jc w:val="center"/>
+            </w:pPr>
+            <w:r>
+              <w:rPr>
+                <w:rFonts w:ascii="Arial" w:cs="Arial" w:eastAsia="Arial" w:hAnsi="Arial"/>
+                <w:b w:val="function bold() { [native code] }"/>
+                <w:bCs w:val="function bold() { [native code] }"/>
+                <w:sz w:val="22"/>
+                <w:szCs w:val="22"/>
+                <w:rtl/>
+              </w:rPr>
+              <w:t xml:space="preserve">192</w:t>
+            </w:r>
+          </w:p>
+        </w:tc>
+        <w:tc>
+          <w:tcPr>
+            <w:tcW w:type="dxa" w:w="1050"/>
+            <w:tcMar>
+              <w:top w:type="dxa" w:w="60"/>
+              <w:left w:type="dxa" w:w="100"/>
+              <w:bottom w:type="dxa" w:w="60"/>
+              <w:right w:type="dxa" w:w="100"/>
+            </w:tcMar>
+            <w:vAlign w:val="center"/>
+          </w:tcPr>
+          <w:p>
+            <w:pPr>
+              <w:bidi/>
+              <w:spacing w:after="0"/>
+              <w:jc w:val="center"/>
+            </w:pPr>
+            <w:r>
+              <w:rPr>
+                <w:rFonts w:ascii="Arial" w:cs="Arial" w:eastAsia="Arial" w:hAnsi="Arial"/>
+                <w:b/>
+                <w:bCs/>
+                <w:sz w:val="22"/>
+                <w:szCs w:val="22"/>
+                <w:rtl/>
+              </w:rPr>
+              <w:t xml:space="preserve">275</w:t>
+            </w:r>
+          </w:p>
+        </w:tc>
+        <w:tc>
+          <w:tcPr>
+            <w:tcW w:type="dxa" w:w="1000"/>
+            <w:tcMar>
+              <w:top w:type="dxa" w:w="60"/>
+              <w:left w:type="dxa" w:w="100"/>
+              <w:bottom w:type="dxa" w:w="60"/>
+              <w:right w:type="dxa" w:w="100"/>
+            </w:tcMar>
+            <w:vAlign w:val="center"/>
+          </w:tcPr>
+          <w:p>
+            <w:pPr>
+              <w:bidi/>
+              <w:spacing w:after="0"/>
+              <w:jc w:val="center"/>
+            </w:pPr>
+            <w:r>
+              <w:rPr>
+                <w:rFonts w:ascii="Arial" w:cs="Arial" w:eastAsia="Arial" w:hAnsi="Arial"/>
+                <w:b w:val="function bold() { [native code] }"/>
+                <w:bCs w:val="function bold() { [native code] }"/>
+                <w:sz w:val="22"/>
+                <w:szCs w:val="22"/>
+                <w:rtl/>
+              </w:rPr>
+              <w:t xml:space="preserve">32</w:t>
+            </w:r>
+          </w:p>
+        </w:tc>
+        <w:tc>
+          <w:tcPr>
+            <w:tcW w:type="dxa" w:w="1000"/>
+            <w:tcMar>
+              <w:top w:type="dxa" w:w="60"/>
+              <w:left w:type="dxa" w:w="100"/>
+              <w:bottom w:type="dxa" w:w="60"/>
+              <w:right w:type="dxa" w:w="100"/>
+            </w:tcMar>
+            <w:vAlign w:val="center"/>
+          </w:tcPr>
+          <w:p>
+            <w:pPr>
+              <w:bidi/>
+              <w:spacing w:after="0"/>
+              <w:jc w:val="center"/>
+            </w:pPr>
+            <w:r>
+              <w:rPr>
+                <w:rFonts w:ascii="Arial" w:cs="Arial" w:eastAsia="Arial" w:hAnsi="Arial"/>
+                <w:b w:val="function bold() { [native code] }"/>
+                <w:bCs w:val="function bold() { [native code] }"/>
+                <w:sz w:val="22"/>
+                <w:szCs w:val="22"/>
+                <w:rtl/>
+              </w:rPr>
+              <w:t xml:space="preserve">42</w:t>
+            </w:r>
+          </w:p>
+        </w:tc>
+        <w:tc>
+          <w:tcPr>
+            <w:tcW w:type="dxa" w:w="1150"/>
+            <w:tcMar>
+              <w:top w:type="dxa" w:w="60"/>
+              <w:left w:type="dxa" w:w="100"/>
+              <w:bottom w:type="dxa" w:w="60"/>
+              <w:right w:type="dxa" w:w="100"/>
+            </w:tcMar>
+            <w:vAlign w:val="center"/>
+          </w:tcPr>
+          <w:p>
+            <w:pPr>
+              <w:bidi/>
+              <w:spacing w:after="0"/>
+              <w:jc w:val="center"/>
+            </w:pPr>
+            <w:r>
+              <w:rPr>
+                <w:rFonts w:ascii="Arial" w:cs="Arial" w:eastAsia="Arial" w:hAnsi="Arial"/>
+                <w:b w:val="function bold() { [native code] }"/>
+                <w:bCs w:val="function bold() { [native code] }"/>
+                <w:sz w:val="22"/>
+                <w:szCs w:val="22"/>
+                <w:rtl/>
+              </w:rPr>
+              <w:t xml:space="preserve">1255</w:t>
+            </w:r>
+          </w:p>
+        </w:tc>
+      </w:tr>
+      <w:tr>
+        <w:tc>
+          <w:tcPr>
+            <w:tcW w:type="dxa" w:w="2000"/>
+            <w:shd w:fill="F2F2F2" w:val="clear"/>
+            <w:tcMar>
+              <w:top w:type="dxa" w:w="60"/>
+              <w:left w:type="dxa" w:w="100"/>
+              <w:bottom w:type="dxa" w:w="60"/>
+              <w:right w:type="dxa" w:w="100"/>
+            </w:tcMar>
+            <w:vAlign w:val="center"/>
+          </w:tcPr>
+          <w:p>
+            <w:pPr>
+              <w:bidi/>
+              <w:spacing w:after="0"/>
+              <w:jc w:val="center"/>
+            </w:pPr>
+            <w:r>
+              <w:rPr>
+                <w:rFonts w:ascii="Arial" w:cs="Arial" w:eastAsia="Arial" w:hAnsi="Arial"/>
+                <w:b w:val="function bold() { [native code] }"/>
+                <w:bCs w:val="function bold() { [native code] }"/>
+                <w:sz w:val="22"/>
+                <w:szCs w:val="22"/>
+                <w:rtl/>
+              </w:rPr>
+              <w:t xml:space="preserve">פילוח פעימה ב' (סוף ספטמבר)</w:t>
+            </w:r>
+          </w:p>
+        </w:tc>
+        <w:tc>
+          <w:tcPr>
+            <w:tcW w:type="dxa" w:w="1100"/>
+            <w:shd w:fill="F2F2F2" w:val="clear"/>
+            <w:tcMar>
+              <w:top w:type="dxa" w:w="60"/>
+              <w:left w:type="dxa" w:w="100"/>
+              <w:bottom w:type="dxa" w:w="60"/>
+              <w:right w:type="dxa" w:w="100"/>
+            </w:tcMar>
+            <w:vAlign w:val="center"/>
+          </w:tcPr>
+          <w:p>
+            <w:pPr>
+              <w:bidi/>
+              <w:spacing w:after="0"/>
+              <w:jc w:val="center"/>
+            </w:pPr>
+            <w:r>
+              <w:rPr>
+                <w:rFonts w:ascii="Arial" w:cs="Arial" w:eastAsia="Arial" w:hAnsi="Arial"/>
+                <w:b w:val="function bold() { [native code] }"/>
+                <w:bCs w:val="function bold() { [native code] }"/>
+                <w:sz w:val="22"/>
+                <w:szCs w:val="22"/>
+                <w:rtl/>
+              </w:rPr>
+              <w:t xml:space="preserve">45</w:t>
+            </w:r>
+          </w:p>
+        </w:tc>
+        <w:tc>
+          <w:tcPr>
+            <w:tcW w:type="dxa" w:w="1050"/>
+            <w:shd w:fill="F2F2F2" w:val="clear"/>
+            <w:tcMar>
+              <w:top w:type="dxa" w:w="60"/>
+              <w:left w:type="dxa" w:w="100"/>
+              <w:bottom w:type="dxa" w:w="60"/>
+              <w:right w:type="dxa" w:w="100"/>
+            </w:tcMar>
+            <w:vAlign w:val="center"/>
+          </w:tcPr>
+          <w:p>
+            <w:pPr>
+              <w:bidi/>
+              <w:spacing w:after="0"/>
+              <w:jc w:val="center"/>
+            </w:pPr>
+            <w:r>
+              <w:rPr>
+                <w:rFonts w:ascii="Arial" w:cs="Arial" w:eastAsia="Arial" w:hAnsi="Arial"/>
+                <w:b w:val="function bold() { [native code] }"/>
+                <w:bCs w:val="function bold() { [native code] }"/>
+                <w:sz w:val="22"/>
+                <w:szCs w:val="22"/>
+                <w:rtl/>
+              </w:rPr>
+              <w:t xml:space="preserve">155</w:t>
+            </w:r>
+          </w:p>
+        </w:tc>
+        <w:tc>
+          <w:tcPr>
+            <w:tcW w:type="dxa" w:w="1050"/>
+            <w:shd w:fill="F2F2F2" w:val="clear"/>
+            <w:tcMar>
+              <w:top w:type="dxa" w:w="60"/>
+              <w:left w:type="dxa" w:w="100"/>
+              <w:bottom w:type="dxa" w:w="60"/>
+              <w:right w:type="dxa" w:w="100"/>
+            </w:tcMar>
+            <w:vAlign w:val="center"/>
+          </w:tcPr>
+          <w:p>
+            <w:pPr>
+              <w:bidi/>
+              <w:spacing w:after="0"/>
+              <w:jc w:val="center"/>
+            </w:pPr>
+            <w:r>
+              <w:rPr>
+                <w:rFonts w:ascii="Arial" w:cs="Arial" w:eastAsia="Arial" w:hAnsi="Arial"/>
+                <w:b w:val="function bold() { [native code] }"/>
+                <w:bCs w:val="function bold() { [native code] }"/>
+                <w:sz w:val="22"/>
+                <w:szCs w:val="22"/>
+                <w:rtl/>
+              </w:rPr>
+              <w:t xml:space="preserve">290</w:t>
+            </w:r>
+          </w:p>
+        </w:tc>
+        <w:tc>
+          <w:tcPr>
+            <w:tcW w:type="dxa" w:w="1050"/>
+            <w:shd w:fill="F2F2F2" w:val="clear"/>
+            <w:tcMar>
+              <w:top w:type="dxa" w:w="60"/>
+              <w:left w:type="dxa" w:w="100"/>
+              <w:bottom w:type="dxa" w:w="60"/>
+              <w:right w:type="dxa" w:w="100"/>
+            </w:tcMar>
+            <w:vAlign w:val="center"/>
+          </w:tcPr>
+          <w:p>
+            <w:pPr>
+              <w:bidi/>
+              <w:spacing w:after="0"/>
+              <w:jc w:val="center"/>
+            </w:pPr>
+            <w:r>
+              <w:rPr>
+                <w:rFonts w:ascii="Arial" w:cs="Arial" w:eastAsia="Arial" w:hAnsi="Arial"/>
+                <w:b/>
+                <w:bCs/>
+                <w:sz w:val="22"/>
+                <w:szCs w:val="22"/>
+                <w:rtl/>
+              </w:rPr>
+              <w:t xml:space="preserve">207</w:t>
+            </w:r>
+          </w:p>
+        </w:tc>
+        <w:tc>
+          <w:tcPr>
+            <w:tcW w:type="dxa" w:w="1000"/>
+            <w:shd w:fill="F2F2F2" w:val="clear"/>
+            <w:tcMar>
+              <w:top w:type="dxa" w:w="60"/>
+              <w:left w:type="dxa" w:w="100"/>
+              <w:bottom w:type="dxa" w:w="60"/>
+              <w:right w:type="dxa" w:w="100"/>
+            </w:tcMar>
+            <w:vAlign w:val="center"/>
+          </w:tcPr>
+          <w:p>
+            <w:pPr>
+              <w:bidi/>
+              <w:spacing w:after="0"/>
+              <w:jc w:val="center"/>
+            </w:pPr>
+            <w:r>
+              <w:rPr>
+                <w:rFonts w:ascii="Arial" w:cs="Arial" w:eastAsia="Arial" w:hAnsi="Arial"/>
+                <w:b w:val="function bold() { [native code] }"/>
+                <w:bCs w:val="function bold() { [native code] }"/>
+                <w:sz w:val="22"/>
+                <w:szCs w:val="22"/>
+                <w:rtl/>
+              </w:rPr>
+              <w:t xml:space="preserve">—</w:t>
+            </w:r>
+          </w:p>
+        </w:tc>
+        <w:tc>
+          <w:tcPr>
+            <w:tcW w:type="dxa" w:w="1000"/>
+            <w:shd w:fill="F2F2F2" w:val="clear"/>
+            <w:tcMar>
+              <w:top w:type="dxa" w:w="60"/>
+              <w:left w:type="dxa" w:w="100"/>
+              <w:bottom w:type="dxa" w:w="60"/>
+              <w:right w:type="dxa" w:w="100"/>
+            </w:tcMar>
+            <w:vAlign w:val="center"/>
+          </w:tcPr>
+          <w:p>
+            <w:pPr>
+              <w:bidi/>
+              <w:spacing w:after="0"/>
+              <w:jc w:val="center"/>
+            </w:pPr>
+            <w:r>
+              <w:rPr>
+                <w:rFonts w:ascii="Arial" w:cs="Arial" w:eastAsia="Arial" w:hAnsi="Arial"/>
+                <w:b w:val="function bold() { [native code] }"/>
+                <w:bCs w:val="function bold() { [native code] }"/>
+                <w:sz w:val="22"/>
+                <w:szCs w:val="22"/>
+                <w:rtl/>
+              </w:rPr>
+              <w:t xml:space="preserve">—</w:t>
+            </w:r>
+          </w:p>
+        </w:tc>
+        <w:tc>
+          <w:tcPr>
+            <w:tcW w:type="dxa" w:w="1150"/>
+            <w:shd w:fill="F2F2F2" w:val="clear"/>
+            <w:tcMar>
+              <w:top w:type="dxa" w:w="60"/>
+              <w:left w:type="dxa" w:w="100"/>
+              <w:bottom w:type="dxa" w:w="60"/>
+              <w:right w:type="dxa" w:w="100"/>
+            </w:tcMar>
+            <w:vAlign w:val="center"/>
+          </w:tcPr>
+          <w:p>
+            <w:pPr>
+              <w:bidi/>
+              <w:spacing w:after="0"/>
+              <w:jc w:val="center"/>
+            </w:pPr>
+            <w:r>
+              <w:rPr>
+                <w:rFonts w:ascii="Arial" w:cs="Arial" w:eastAsia="Arial" w:hAnsi="Arial"/>
+                <w:b w:val="function bold() { [native code] }"/>
+                <w:bCs w:val="function bold() { [native code] }"/>
+                <w:sz w:val="22"/>
+                <w:szCs w:val="22"/>
+                <w:rtl/>
+              </w:rPr>
+              <w:t xml:space="preserve">697</w:t>
+            </w:r>
+          </w:p>
+        </w:tc>
+      </w:tr>
+    </w:tbl>
+    <w:p>
+      <w:pPr>
+        <w:bidi/>
+        <w:spacing w:after="120"/>
+        <w:jc w:val="right"/>
+      </w:pPr>
+      <w:r>
+        <w:rPr>
+          <w:rFonts w:ascii="Arial" w:cs="Arial" w:eastAsia="Arial" w:hAnsi="Arial"/>
+          <w:b w:val="false"/>
+          <w:bCs w:val="false"/>
+          <w:rtl/>
+        </w:rPr>
+        <w:t xml:space="preserve"/>
+      </w:r>
+    </w:p>
+    <w:p>
+      <w:pPr>
+        <w:bidi/>
+        <w:spacing w:after="100" w:before="120"/>
+        <w:jc w:val="right"/>
+      </w:pPr>
+      <w:r>
+        <w:rPr>
+          <w:rFonts w:ascii="Arial" w:cs="Arial" w:eastAsia="Arial" w:hAnsi="Arial"/>
+          <w:b/>
+          <w:bCs/>
+          <w:rtl/>
+        </w:rPr>
+        <w:t xml:space="preserve">נספח ב' — פקודת חלוקת קסדות פעימה ב', 29.9.2025 (הודעה מהקצין, מ"פ מילואים)</w:t>
+      </w:r>
+    </w:p>
+    <w:p>
+      <w:pPr>
+        <w:bidi/>
+        <w:spacing w:after="120"/>
+        <w:jc w:val="right"/>
+      </w:pPr>
+      <w:r>
+        <w:rPr>
+          <w:rFonts w:ascii="Arial" w:cs="Arial" w:eastAsia="Arial" w:hAnsi="Arial"/>
+          <w:b w:val="false"/>
+          <w:bCs w:val="false"/>
+          <w:sz w:val="20"/>
+          <w:szCs w:val="20"/>
+          <w:rtl/>
+        </w:rPr>
+        <w:t xml:space="preserve">נוסח ההודעה כפי שהתקבלה (שוחזר מצילום השיחה, 29.9.2025 12:55):</w:t>
+      </w:r>
+    </w:p>
+    <w:tbl>
+      <w:tblPr>
+        <w:bidiVisual/>
+        <w:tblW w:type="dxa" w:w="6400"/>
+        <w:tblBorders>
+          <w:top w:val="single" w:color="auto" w:sz="4"/>
+          <w:left w:val="single" w:color="auto" w:sz="4"/>
+          <w:bottom w:val="single" w:color="auto" w:sz="4"/>
+          <w:right w:val="single" w:color="auto" w:sz="4"/>
+          <w:insideH w:val="single" w:color="auto" w:sz="4"/>
+          <w:insideV w:val="single" w:color="auto" w:sz="4"/>
+        </w:tblBorders>
+      </w:tblPr>
+      <w:tblGrid>
+        <w:gridCol w:w="4200"/>
+        <w:gridCol w:w="2200"/>
+      </w:tblGrid>
+      <w:tr>
+        <w:tc>
+          <w:tcPr>
+            <w:tcW w:type="dxa" w:w="4200"/>
+            <w:shd w:fill="9E1B1B" w:val="clear"/>
+            <w:tcMar>
+              <w:top w:type="dxa" w:w="60"/>
+              <w:left w:type="dxa" w:w="100"/>
+              <w:bottom w:type="dxa" w:w="60"/>
+              <w:right w:type="dxa" w:w="100"/>
+            </w:tcMar>
+            <w:vAlign w:val="center"/>
+          </w:tcPr>
+          <w:p>
+            <w:pPr>
+              <w:bidi/>
+              <w:spacing w:after="0"/>
+              <w:jc w:val="center"/>
+            </w:pPr>
+            <w:r>
+              <w:rPr>
+                <w:rFonts w:ascii="Arial" w:cs="Arial" w:eastAsia="Arial" w:hAnsi="Arial"/>
+                <w:b/>
+                <w:bCs/>
+                <w:color w:val="FFFFFF"/>
+                <w:sz w:val="22"/>
+                <w:szCs w:val="22"/>
+                <w:rtl/>
+              </w:rPr>
+              <w:t xml:space="preserve">גורם</w:t>
+            </w:r>
+          </w:p>
+        </w:tc>
+        <w:tc>
+          <w:tcPr>
+            <w:tcW w:type="dxa" w:w="2200"/>
+            <w:shd w:fill="9E1B1B" w:val="clear"/>
+            <w:tcMar>
+              <w:top w:type="dxa" w:w="60"/>
+              <w:left w:type="dxa" w:w="100"/>
+              <w:bottom w:type="dxa" w:w="60"/>
+              <w:right w:type="dxa" w:w="100"/>
+            </w:tcMar>
+            <w:vAlign w:val="center"/>
+          </w:tcPr>
+          <w:p>
+            <w:pPr>
+              <w:bidi/>
+              <w:spacing w:after="0"/>
+              <w:jc w:val="center"/>
+            </w:pPr>
+            <w:r>
+              <w:rPr>
+                <w:rFonts w:ascii="Arial" w:cs="Arial" w:eastAsia="Arial" w:hAnsi="Arial"/>
+                <w:b/>
+                <w:bCs/>
+                <w:color w:val="FFFFFF"/>
+                <w:sz w:val="22"/>
+                <w:szCs w:val="22"/>
+                <w:rtl/>
+              </w:rPr>
+              <w:t xml:space="preserve">הקצאה (יח')</w:t>
+            </w:r>
+          </w:p>
+        </w:tc>
+      </w:tr>
+      <w:tr>
+        <w:tc>
+          <w:tcPr>
+            <w:tcW w:type="dxa" w:w="4200"/>
+            <w:tcMar>
+              <w:top w:type="dxa" w:w="60"/>
+              <w:left w:type="dxa" w:w="100"/>
+              <w:bottom w:type="dxa" w:w="60"/>
+              <w:right w:type="dxa" w:w="100"/>
+            </w:tcMar>
+            <w:vAlign w:val="center"/>
+          </w:tcPr>
+          <w:p>
+            <w:pPr>
+              <w:bidi/>
+              <w:spacing w:after="0"/>
+              <w:jc w:val="center"/>
+            </w:pPr>
+            <w:r>
+              <w:rPr>
+                <w:rFonts w:ascii="Arial" w:cs="Arial" w:eastAsia="Arial" w:hAnsi="Arial"/>
+                <w:b w:val="function bold() { [native code] }"/>
+                <w:bCs w:val="function bold() { [native code] }"/>
+                <w:sz w:val="22"/>
+                <w:szCs w:val="22"/>
+                <w:rtl/>
+              </w:rPr>
+              <w:t xml:space="preserve">גדס"ר</w:t>
+            </w:r>
+          </w:p>
+        </w:tc>
+        <w:tc>
+          <w:tcPr>
+            <w:tcW w:type="dxa" w:w="2200"/>
+            <w:tcMar>
+              <w:top w:type="dxa" w:w="60"/>
+              <w:left w:type="dxa" w:w="100"/>
+              <w:bottom w:type="dxa" w:w="60"/>
+              <w:right w:type="dxa" w:w="100"/>
+            </w:tcMar>
+            <w:vAlign w:val="center"/>
+          </w:tcPr>
+          <w:p>
+            <w:pPr>
+              <w:bidi/>
+              <w:spacing w:after="0"/>
+              <w:jc w:val="center"/>
+            </w:pPr>
+            <w:r>
+              <w:rPr>
+                <w:rFonts w:ascii="Arial" w:cs="Arial" w:eastAsia="Arial" w:hAnsi="Arial"/>
+                <w:b w:val="function bold() { [native code] }"/>
+                <w:bCs w:val="function bold() { [native code] }"/>
+                <w:sz w:val="22"/>
+                <w:szCs w:val="22"/>
+                <w:rtl/>
+              </w:rPr>
+              <w:t xml:space="preserve">40</w:t>
+            </w:r>
+          </w:p>
+        </w:tc>
+      </w:tr>
+      <w:tr>
+        <w:tc>
+          <w:tcPr>
+            <w:tcW w:type="dxa" w:w="4200"/>
+            <w:shd w:fill="F2F2F2" w:val="clear"/>
+            <w:tcMar>
+              <w:top w:type="dxa" w:w="60"/>
+              <w:left w:type="dxa" w:w="100"/>
+              <w:bottom w:type="dxa" w:w="60"/>
+              <w:right w:type="dxa" w:w="100"/>
+            </w:tcMar>
+            <w:vAlign w:val="center"/>
+          </w:tcPr>
+          <w:p>
+            <w:pPr>
+              <w:bidi/>
+              <w:spacing w:after="0"/>
+              <w:jc w:val="center"/>
+            </w:pPr>
+            <w:r>
+              <w:rPr>
+                <w:rFonts w:ascii="Arial" w:cs="Arial" w:eastAsia="Arial" w:hAnsi="Arial"/>
+                <w:b w:val="function bold() { [native code] }"/>
+                <w:bCs w:val="function bold() { [native code] }"/>
+                <w:sz w:val="22"/>
+                <w:szCs w:val="22"/>
+                <w:rtl/>
+              </w:rPr>
+              <w:t xml:space="preserve">גד' 66</w:t>
+            </w:r>
+          </w:p>
+        </w:tc>
+        <w:tc>
+          <w:tcPr>
+            <w:tcW w:type="dxa" w:w="2200"/>
+            <w:shd w:fill="F2F2F2" w:val="clear"/>
+            <w:tcMar>
+              <w:top w:type="dxa" w:w="60"/>
+              <w:left w:type="dxa" w:w="100"/>
+              <w:bottom w:type="dxa" w:w="60"/>
+              <w:right w:type="dxa" w:w="100"/>
+            </w:tcMar>
+            <w:vAlign w:val="center"/>
+          </w:tcPr>
+          <w:p>
+            <w:pPr>
+              <w:bidi/>
+              <w:spacing w:after="0"/>
+              <w:jc w:val="center"/>
+            </w:pPr>
+            <w:r>
+              <w:rPr>
+                <w:rFonts w:ascii="Arial" w:cs="Arial" w:eastAsia="Arial" w:hAnsi="Arial"/>
+                <w:b w:val="function bold() { [native code] }"/>
+                <w:bCs w:val="function bold() { [native code] }"/>
+                <w:sz w:val="22"/>
+                <w:szCs w:val="22"/>
+                <w:rtl/>
+              </w:rPr>
+              <w:t xml:space="preserve">200</w:t>
+            </w:r>
+          </w:p>
+        </w:tc>
+      </w:tr>
+      <w:tr>
+        <w:tc>
+          <w:tcPr>
+            <w:tcW w:type="dxa" w:w="4200"/>
+            <w:tcMar>
+              <w:top w:type="dxa" w:w="60"/>
+              <w:left w:type="dxa" w:w="100"/>
+              <w:bottom w:type="dxa" w:w="60"/>
+              <w:right w:type="dxa" w:w="100"/>
+            </w:tcMar>
+            <w:vAlign w:val="center"/>
+          </w:tcPr>
+          <w:p>
+            <w:pPr>
+              <w:bidi/>
+              <w:spacing w:after="0"/>
+              <w:jc w:val="center"/>
+            </w:pPr>
+            <w:r>
+              <w:rPr>
+                <w:rFonts w:ascii="Arial" w:cs="Arial" w:eastAsia="Arial" w:hAnsi="Arial"/>
+                <w:b/>
+                <w:bCs/>
+                <w:sz w:val="22"/>
+                <w:szCs w:val="22"/>
+                <w:rtl/>
+              </w:rPr>
+              <w:t xml:space="preserve">גד' 28</w:t>
+            </w:r>
+          </w:p>
+        </w:tc>
+        <w:tc>
+          <w:tcPr>
+            <w:tcW w:type="dxa" w:w="2200"/>
+            <w:tcMar>
+              <w:top w:type="dxa" w:w="60"/>
+              <w:left w:type="dxa" w:w="100"/>
+              <w:bottom w:type="dxa" w:w="60"/>
+              <w:right w:type="dxa" w:w="100"/>
+            </w:tcMar>
+            <w:vAlign w:val="center"/>
+          </w:tcPr>
+          <w:p>
+            <w:pPr>
+              <w:bidi/>
+              <w:spacing w:after="0"/>
+              <w:jc w:val="center"/>
+            </w:pPr>
+            <w:r>
+              <w:rPr>
+                <w:rFonts w:ascii="Arial" w:cs="Arial" w:eastAsia="Arial" w:hAnsi="Arial"/>
+                <w:b/>
+                <w:bCs/>
+                <w:sz w:val="22"/>
+                <w:szCs w:val="22"/>
+                <w:rtl/>
+              </w:rPr>
+              <w:t xml:space="preserve">123</w:t>
+            </w:r>
+          </w:p>
+        </w:tc>
+      </w:tr>
+      <w:tr>
+        <w:tc>
+          <w:tcPr>
+            <w:tcW w:type="dxa" w:w="4200"/>
+            <w:shd w:fill="F2F2F2" w:val="clear"/>
+            <w:tcMar>
+              <w:top w:type="dxa" w:w="60"/>
+              <w:left w:type="dxa" w:w="100"/>
+              <w:bottom w:type="dxa" w:w="60"/>
+              <w:right w:type="dxa" w:w="100"/>
+            </w:tcMar>
+            <w:vAlign w:val="center"/>
+          </w:tcPr>
+          <w:p>
+            <w:pPr>
+              <w:bidi/>
+              <w:spacing w:after="0"/>
+              <w:jc w:val="center"/>
+            </w:pPr>
+            <w:r>
+              <w:rPr>
+                <w:rFonts w:ascii="Arial" w:cs="Arial" w:eastAsia="Arial" w:hAnsi="Arial"/>
+                <w:b w:val="function bold() { [native code] }"/>
+                <w:bCs w:val="function bold() { [native code] }"/>
+                <w:sz w:val="22"/>
+                <w:szCs w:val="22"/>
+                <w:rtl/>
+              </w:rPr>
+              <w:t xml:space="preserve">גד' 71</w:t>
+            </w:r>
+          </w:p>
+        </w:tc>
+        <w:tc>
+          <w:tcPr>
+            <w:tcW w:type="dxa" w:w="2200"/>
+            <w:shd w:fill="F2F2F2" w:val="clear"/>
+            <w:tcMar>
+              <w:top w:type="dxa" w:w="60"/>
+              <w:left w:type="dxa" w:w="100"/>
+              <w:bottom w:type="dxa" w:w="60"/>
+              <w:right w:type="dxa" w:w="100"/>
+            </w:tcMar>
+            <w:vAlign w:val="center"/>
+          </w:tcPr>
+          <w:p>
+            <w:pPr>
+              <w:bidi/>
+              <w:spacing w:after="0"/>
+              <w:jc w:val="center"/>
+            </w:pPr>
+            <w:r>
+              <w:rPr>
+                <w:rFonts w:ascii="Arial" w:cs="Arial" w:eastAsia="Arial" w:hAnsi="Arial"/>
+                <w:b w:val="function bold() { [native code] }"/>
+                <w:bCs w:val="function bold() { [native code] }"/>
+                <w:sz w:val="22"/>
+                <w:szCs w:val="22"/>
+                <w:rtl/>
+              </w:rPr>
+              <w:t xml:space="preserve">130</w:t>
+            </w:r>
+          </w:p>
+        </w:tc>
+      </w:tr>
+      <w:tr>
+        <w:tc>
+          <w:tcPr>
+            <w:tcW w:type="dxa" w:w="4200"/>
+            <w:tcMar>
+              <w:top w:type="dxa" w:w="60"/>
+              <w:left w:type="dxa" w:w="100"/>
+              <w:bottom w:type="dxa" w:w="60"/>
+              <w:right w:type="dxa" w:w="100"/>
+            </w:tcMar>
+            <w:vAlign w:val="center"/>
+          </w:tcPr>
+          <w:p>
+            <w:pPr>
+              <w:bidi/>
+              <w:spacing w:after="0"/>
+              <w:jc w:val="center"/>
+            </w:pPr>
+            <w:r>
+              <w:rPr>
+                <w:rFonts w:ascii="Arial" w:cs="Arial" w:eastAsia="Arial" w:hAnsi="Arial"/>
+                <w:b w:val="function bold() { [native code] }"/>
+                <w:bCs w:val="function bold() { [native code] }"/>
+                <w:sz w:val="22"/>
+                <w:szCs w:val="22"/>
+                <w:rtl/>
+              </w:rPr>
+              <w:t xml:space="preserve">חפ"ק סמח"ט</w:t>
+            </w:r>
+          </w:p>
+        </w:tc>
+        <w:tc>
+          <w:tcPr>
+            <w:tcW w:type="dxa" w:w="2200"/>
+            <w:tcMar>
+              <w:top w:type="dxa" w:w="60"/>
+              <w:left w:type="dxa" w:w="100"/>
+              <w:bottom w:type="dxa" w:w="60"/>
+              <w:right w:type="dxa" w:w="100"/>
+            </w:tcMar>
+            <w:vAlign w:val="center"/>
+          </w:tcPr>
+          <w:p>
+            <w:pPr>
+              <w:bidi/>
+              <w:spacing w:after="0"/>
+              <w:jc w:val="center"/>
+            </w:pPr>
+            <w:r>
+              <w:rPr>
+                <w:rFonts w:ascii="Arial" w:cs="Arial" w:eastAsia="Arial" w:hAnsi="Arial"/>
+                <w:b w:val="function bold() { [native code] }"/>
+                <w:bCs w:val="function bold() { [native code] }"/>
+                <w:sz w:val="22"/>
+                <w:szCs w:val="22"/>
+                <w:rtl/>
+              </w:rPr>
+              <w:t xml:space="preserve">8</w:t>
+            </w:r>
+          </w:p>
+        </w:tc>
+      </w:tr>
+      <w:tr>
+        <w:tc>
+          <w:tcPr>
+            <w:tcW w:type="dxa" w:w="4200"/>
+            <w:shd w:fill="F2F2F2" w:val="clear"/>
+            <w:tcMar>
+              <w:top w:type="dxa" w:w="60"/>
+              <w:left w:type="dxa" w:w="100"/>
+              <w:bottom w:type="dxa" w:w="60"/>
+              <w:right w:type="dxa" w:w="100"/>
+            </w:tcMar>
+            <w:vAlign w:val="center"/>
+          </w:tcPr>
+          <w:p>
+            <w:pPr>
+              <w:bidi/>
+              <w:spacing w:after="0"/>
+              <w:jc w:val="center"/>
+            </w:pPr>
+            <w:r>
+              <w:rPr>
+                <w:rFonts w:ascii="Arial" w:cs="Arial" w:eastAsia="Arial" w:hAnsi="Arial"/>
+                <w:b w:val="function bold() { [native code] }"/>
+                <w:bCs w:val="function bold() { [native code] }"/>
+                <w:sz w:val="22"/>
+                <w:szCs w:val="22"/>
+                <w:rtl/>
+              </w:rPr>
+              <w:t xml:space="preserve">חפ"ק מח"ט</w:t>
+            </w:r>
+          </w:p>
+        </w:tc>
+        <w:tc>
+          <w:tcPr>
+            <w:tcW w:type="dxa" w:w="2200"/>
+            <w:shd w:fill="F2F2F2" w:val="clear"/>
+            <w:tcMar>
+              <w:top w:type="dxa" w:w="60"/>
+              <w:left w:type="dxa" w:w="100"/>
+              <w:bottom w:type="dxa" w:w="60"/>
+              <w:right w:type="dxa" w:w="100"/>
+            </w:tcMar>
+            <w:vAlign w:val="center"/>
+          </w:tcPr>
+          <w:p>
+            <w:pPr>
+              <w:bidi/>
+              <w:spacing w:after="0"/>
+              <w:jc w:val="center"/>
+            </w:pPr>
+            <w:r>
+              <w:rPr>
+                <w:rFonts w:ascii="Arial" w:cs="Arial" w:eastAsia="Arial" w:hAnsi="Arial"/>
+                <w:b w:val="function bold() { [native code] }"/>
+                <w:bCs w:val="function bold() { [native code] }"/>
+                <w:sz w:val="22"/>
+                <w:szCs w:val="22"/>
+                <w:rtl/>
+              </w:rPr>
+              <w:t xml:space="preserve">8</w:t>
+            </w:r>
+          </w:p>
+        </w:tc>
+      </w:tr>
+      <w:tr>
+        <w:tc>
+          <w:tcPr>
+            <w:tcW w:type="dxa" w:w="4200"/>
+            <w:tcMar>
+              <w:top w:type="dxa" w:w="60"/>
+              <w:left w:type="dxa" w:w="100"/>
+              <w:bottom w:type="dxa" w:w="60"/>
+              <w:right w:type="dxa" w:w="100"/>
+            </w:tcMar>
+            <w:vAlign w:val="center"/>
+          </w:tcPr>
+          <w:p>
+            <w:pPr>
+              <w:bidi/>
+              <w:spacing w:after="0"/>
+              <w:jc w:val="center"/>
+            </w:pPr>
+            <w:r>
+              <w:rPr>
+                <w:rFonts w:ascii="Arial" w:cs="Arial" w:eastAsia="Arial" w:hAnsi="Arial"/>
+                <w:b w:val="function bold() { [native code] }"/>
+                <w:bCs w:val="function bold() { [native code] }"/>
+                <w:sz w:val="22"/>
+                <w:szCs w:val="22"/>
+                <w:rtl/>
+              </w:rPr>
+              <w:t xml:space="preserve">מפח"ט</w:t>
+            </w:r>
+          </w:p>
+        </w:tc>
+        <w:tc>
+          <w:tcPr>
+            <w:tcW w:type="dxa" w:w="2200"/>
+            <w:tcMar>
+              <w:top w:type="dxa" w:w="60"/>
+              <w:left w:type="dxa" w:w="100"/>
+              <w:bottom w:type="dxa" w:w="60"/>
+              <w:right w:type="dxa" w:w="100"/>
+            </w:tcMar>
+            <w:vAlign w:val="center"/>
+          </w:tcPr>
+          <w:p>
+            <w:pPr>
+              <w:bidi/>
+              <w:spacing w:after="0"/>
+              <w:jc w:val="center"/>
+            </w:pPr>
+            <w:r>
+              <w:rPr>
+                <w:rFonts w:ascii="Arial" w:cs="Arial" w:eastAsia="Arial" w:hAnsi="Arial"/>
+                <w:b w:val="function bold() { [native code] }"/>
+                <w:bCs w:val="function bold() { [native code] }"/>
+                <w:sz w:val="22"/>
+                <w:szCs w:val="22"/>
+                <w:rtl/>
+              </w:rPr>
+              <w:t xml:space="preserve">16</w:t>
+            </w:r>
+          </w:p>
+        </w:tc>
+      </w:tr>
+      <w:tr>
+        <w:tc>
+          <w:tcPr>
+            <w:tcW w:type="dxa" w:w="4200"/>
+            <w:shd w:fill="F2F2F2" w:val="clear"/>
+            <w:tcMar>
+              <w:top w:type="dxa" w:w="60"/>
+              <w:left w:type="dxa" w:w="100"/>
+              <w:bottom w:type="dxa" w:w="60"/>
+              <w:right w:type="dxa" w:w="100"/>
+            </w:tcMar>
+            <w:vAlign w:val="center"/>
+          </w:tcPr>
+          <w:p>
+            <w:pPr>
+              <w:bidi/>
+              <w:spacing w:after="0"/>
+              <w:jc w:val="center"/>
+            </w:pPr>
+            <w:r>
+              <w:rPr>
+                <w:rFonts w:ascii="Arial" w:cs="Arial" w:eastAsia="Arial" w:hAnsi="Arial"/>
+                <w:b w:val="function bold() { [native code] }"/>
+                <w:bCs w:val="function bold() { [native code] }"/>
+                <w:sz w:val="22"/>
+                <w:szCs w:val="22"/>
+                <w:rtl/>
+              </w:rPr>
+              <w:t xml:space="preserve">פלת"צ</w:t>
+            </w:r>
+          </w:p>
+        </w:tc>
+        <w:tc>
+          <w:tcPr>
+            <w:tcW w:type="dxa" w:w="2200"/>
+            <w:shd w:fill="F2F2F2" w:val="clear"/>
+            <w:tcMar>
+              <w:top w:type="dxa" w:w="60"/>
+              <w:left w:type="dxa" w:w="100"/>
+              <w:bottom w:type="dxa" w:w="60"/>
+              <w:right w:type="dxa" w:w="100"/>
+            </w:tcMar>
+            <w:vAlign w:val="center"/>
+          </w:tcPr>
+          <w:p>
+            <w:pPr>
+              <w:bidi/>
+              <w:spacing w:after="0"/>
+              <w:jc w:val="center"/>
+            </w:pPr>
+            <w:r>
+              <w:rPr>
+                <w:rFonts w:ascii="Arial" w:cs="Arial" w:eastAsia="Arial" w:hAnsi="Arial"/>
+                <w:b w:val="function bold() { [native code] }"/>
+                <w:bCs w:val="function bold() { [native code] }"/>
+                <w:sz w:val="22"/>
+                <w:szCs w:val="22"/>
+                <w:rtl/>
+              </w:rPr>
+              <w:t xml:space="preserve">15</w:t>
+            </w:r>
+          </w:p>
+        </w:tc>
+      </w:tr>
+      <w:tr>
+        <w:tc>
+          <w:tcPr>
+            <w:tcW w:type="dxa" w:w="4200"/>
+            <w:tcMar>
+              <w:top w:type="dxa" w:w="60"/>
+              <w:left w:type="dxa" w:w="100"/>
+              <w:bottom w:type="dxa" w:w="60"/>
+              <w:right w:type="dxa" w:w="100"/>
+            </w:tcMar>
+            <w:vAlign w:val="center"/>
+          </w:tcPr>
+          <w:p>
+            <w:pPr>
+              <w:bidi/>
+              <w:spacing w:after="0"/>
+              <w:jc w:val="center"/>
+            </w:pPr>
+            <w:r>
+              <w:rPr>
+                <w:rFonts w:ascii="Arial" w:cs="Arial" w:eastAsia="Arial" w:hAnsi="Arial"/>
+                <w:b w:val="function bold() { [native code] }"/>
+                <w:bCs w:val="function bold() { [native code] }"/>
+                <w:sz w:val="22"/>
+                <w:szCs w:val="22"/>
+                <w:rtl/>
+              </w:rPr>
+              <w:t xml:space="preserve">פלחי"ק</w:t>
+            </w:r>
+          </w:p>
+        </w:tc>
+        <w:tc>
+          <w:tcPr>
+            <w:tcW w:type="dxa" w:w="2200"/>
+            <w:tcMar>
+              <w:top w:type="dxa" w:w="60"/>
+              <w:left w:type="dxa" w:w="100"/>
+              <w:bottom w:type="dxa" w:w="60"/>
+              <w:right w:type="dxa" w:w="100"/>
+            </w:tcMar>
+            <w:vAlign w:val="center"/>
+          </w:tcPr>
+          <w:p>
+            <w:pPr>
+              <w:bidi/>
+              <w:spacing w:after="0"/>
+              <w:jc w:val="center"/>
+            </w:pPr>
+            <w:r>
+              <w:rPr>
+                <w:rFonts w:ascii="Arial" w:cs="Arial" w:eastAsia="Arial" w:hAnsi="Arial"/>
+                <w:b w:val="function bold() { [native code] }"/>
+                <w:bCs w:val="function bold() { [native code] }"/>
+                <w:sz w:val="22"/>
+                <w:szCs w:val="22"/>
+                <w:rtl/>
+              </w:rPr>
+              <w:t xml:space="preserve">10</w:t>
+            </w:r>
+          </w:p>
+        </w:tc>
+      </w:tr>
+      <w:tr>
+        <w:tc>
+          <w:tcPr>
+            <w:tcW w:type="dxa" w:w="4200"/>
+            <w:shd w:fill="F2F2F2" w:val="clear"/>
+            <w:tcMar>
+              <w:top w:type="dxa" w:w="60"/>
+              <w:left w:type="dxa" w:w="100"/>
+              <w:bottom w:type="dxa" w:w="60"/>
+              <w:right w:type="dxa" w:w="100"/>
+            </w:tcMar>
+            <w:vAlign w:val="center"/>
+          </w:tcPr>
+          <w:p>
+            <w:pPr>
+              <w:bidi/>
+              <w:spacing w:after="0"/>
+              <w:jc w:val="center"/>
+            </w:pPr>
+            <w:r>
+              <w:rPr>
+                <w:rFonts w:ascii="Arial" w:cs="Arial" w:eastAsia="Arial" w:hAnsi="Arial"/>
+                <w:b w:val="function bold() { [native code] }"/>
+                <w:bCs w:val="function bold() { [native code] }"/>
+                <w:sz w:val="22"/>
+                <w:szCs w:val="22"/>
+                <w:rtl/>
+              </w:rPr>
+              <w:t xml:space="preserve">להחזיר לדין</w:t>
+            </w:r>
+          </w:p>
+        </w:tc>
+        <w:tc>
+          <w:tcPr>
+            <w:tcW w:type="dxa" w:w="2200"/>
+            <w:shd w:fill="F2F2F2" w:val="clear"/>
+            <w:tcMar>
+              <w:top w:type="dxa" w:w="60"/>
+              <w:left w:type="dxa" w:w="100"/>
+              <w:bottom w:type="dxa" w:w="60"/>
+              <w:right w:type="dxa" w:w="100"/>
+            </w:tcMar>
+            <w:vAlign w:val="center"/>
+          </w:tcPr>
+          <w:p>
+            <w:pPr>
+              <w:bidi/>
+              <w:spacing w:after="0"/>
+              <w:jc w:val="center"/>
+            </w:pPr>
+            <w:r>
+              <w:rPr>
+                <w:rFonts w:ascii="Arial" w:cs="Arial" w:eastAsia="Arial" w:hAnsi="Arial"/>
+                <w:b w:val="function bold() { [native code] }"/>
+                <w:bCs w:val="function bold() { [native code] }"/>
+                <w:sz w:val="22"/>
+                <w:szCs w:val="22"/>
+                <w:rtl/>
+              </w:rPr>
+              <w:t xml:space="preserve">147</w:t>
+            </w:r>
+          </w:p>
+        </w:tc>
+      </w:tr>
+    </w:tbl>
     <w:sectPr>
       <w:pgSz w:w="11906" w:h="16838" w:orient="portrait"/>
       <w:pgMar w:top="1000" w:right="1100" w:bottom="1000" w:left="1100" w:header="708" w:footer="708" w:gutter="0"/>

</xml_diff>